<commit_message>
Update institution/title, casualize DejaVu labels, add Horn-clause procedural-encoding note to report
Co-Authored-By: Claude Sonnet 5 <noreply@anthropic.com>
</commit_message>
<xml_diff>
--- a/de_cuong_KG_GraphRAG_vien_thong (1).docx
+++ b/de_cuong_KG_GraphRAG_vien_thong (1).docx
@@ -63,7 +63,7 @@
           <w:sz w:val="28"/>
           <w:szCs w:val="28"/>
         </w:rPr>
-        <w:t>Hệ thống hỗ trợ phân tích và chẩn đoán sự cố hệ thống mạng và dịch vụ CNTT sử dụng Knowledge Graph, GraphRAG và Rule-Based Reasoning</w:t>
+        <w:t>Trợ lý chẩn đoán nguyên nhân gốc rễ sự cố mạng/CNTT dựa trên tri thức: Knowledge Graph, luật suy diễn và GraphRAG</w:t>
       </w:r>
     </w:p>
     <w:p>
@@ -96,7 +96,7 @@
           <w:sz w:val="26"/>
           <w:szCs w:val="26"/>
         </w:rPr>
-        <w:t>Tên đề tài: Hệ thống hỗ trợ phân tích và chẩn đoán sự cố hệ thống mạng và dịch vụ CNTT sử dụng Knowledge Graph, GraphRAG và Rule-Based Reasoning.</w:t>
+        <w:t>Tên đề tài: Trợ lý chẩn đoán nguyên nhân gốc rễ sự cố mạng/CNTT dựa trên tri thức: Knowledge Graph, luật suy diễn và GraphRAG.</w:t>
       </w:r>
     </w:p>
     <w:p>

</xml_diff>